<commit_message>
Enforce 12pt student font floor across Unit 1+2 printables and quizzes
Co-authored-by: Cursor <cursoragent@cursor.com>
</commit_message>
<xml_diff>
--- a/production/activities/unit-02/fast-and-curious.docx
+++ b/production/activities/unit-02/fast-and-curious.docx
@@ -154,7 +154,7 @@
                 <w:b/>
                 <w:i w:val="0"/>
                 <w:color w:val="FFFFFF"/>
-                <w:sz w:val="22"/>
+                <w:sz w:val="24"/>
               </w:rPr>
               <w:t>Ramp height (books)</w:t>
             </w:r>
@@ -181,7 +181,7 @@
                 <w:b/>
                 <w:i w:val="0"/>
                 <w:color w:val="FFFFFF"/>
-                <w:sz w:val="22"/>
+                <w:sz w:val="24"/>
               </w:rPr>
               <w:t>Trial 1 push (cm)</w:t>
             </w:r>
@@ -208,7 +208,7 @@
                 <w:b/>
                 <w:i w:val="0"/>
                 <w:color w:val="FFFFFF"/>
-                <w:sz w:val="22"/>
+                <w:sz w:val="24"/>
               </w:rPr>
               <w:t>Trial 2 push (cm)</w:t>
             </w:r>
@@ -235,7 +235,7 @@
                 <w:b/>
                 <w:i w:val="0"/>
                 <w:color w:val="FFFFFF"/>
-                <w:sz w:val="22"/>
+                <w:sz w:val="24"/>
               </w:rPr>
               <w:t>Average push (cm)</w:t>
             </w:r>

</xml_diff>